<commit_message>
Typeset abstract notation to publication style; tie Intro to four-regime frame
Abstract (verbatim wording/values unchanged, typesetting only): 4.4e-16 ->
4.4x10^-16 etc., cm3/s -> cm3/s (superscript), 4x10^6 -> 4x10^6 (superscript),
Te/Ti -> T_e/T_i (subscript) to match body style. Intro (iii): '...across
combinatorial, time-dependent, and spatial regimes' -> '...from the equilibrium
baseline across ...', removing the three-vs-four ambiguity. Regenerated docx.

Co-Authored-By: Claude Opus 4.8 <noreply@anthropic.com>
</commit_message>
<xml_diff>
--- a/docs/manuscript_draft.docx
+++ b/docs/manuscript_draft.docx
@@ -73,22 +73,51 @@
           <w:b w:val="0"/>
           <w:i w:val="0"/>
         </w:rPr>
-        <w:t>Aneutronic proton–boron-11 (p-11B) fusion has been argued, on the basis of updated cross-sections and kinetic effects, to admit a marginal thermonuclear ignition window. We test the robustness of this conclusion with a self-consistent, zero-dimensional kinetic power-balance model employing a Maxwell-preserving Fokker–Planck discretization, and we extend the analysis across confinement regimes. Integrating three modern cross-section parameterizations through an identical reactivity integrator, we find the thermal reactivity at 300 keV spans ~20% (Tentori–Belloni 4.4e-16, Wang 3.6e-16, Nevins–Swain 3.5e-16 cm3/s), and that this spread alone determines whether the thermal fusion-to-bremsstrahlung ratio sits above (~1.20) or at (~1.01) threshold under an identical self-consistent electron temperature (Te/Ti ~ 0.42). The surviving net gain in the kinetic peak rests entirely on the alpha-driven R-matrix enhancement; with the Coulomb (Putvinski) enhancement alone it is sub-ignition. We further show the two principal kinetic uncertainties—steady-state alpha density and the R-matrix factor—are mathematically degenerate, so ignition is governed by a single effective parameter. Extending to a four-term net-power budget, we scan 4x10</w:t>
-      </w:r>
-      <w:r>
-        <w:rPr>
-          <w:b w:val="0"/>
-          <w:i w:val="0"/>
-          <w:vertAlign w:val="superscript"/>
-        </w:rPr>
-        <w:t>6</w:t>
-      </w:r>
-      <w:r>
-        <w:rPr>
-          <w:b w:val="0"/>
-          <w:i w:val="0"/>
-        </w:rPr>
-        <w:t xml:space="preserve"> parameter combinations and find no positive net-power island under conservative (Rider) accounting; a time-dependent treatment shows the transient Te&lt;Ti window yields cycle-integrated gain &lt;&lt;1; and a 1-D treatment shows spatial separation is dominated by transport losses. Across equilibrium, combinatorial, transient, and spatial regimes, conservatively-modeled p-11B ignition remains marginal to sub-threshold. Reproducible cross-section benchmarking and uncertainty propagation are prerequisites for any p-11B ignition claim.</w:t>
+        <w:t>Aneutronic proton–boron-11 (p-11B) fusion has been argued, on the basis of updated cross-sections and kinetic effects, to admit a marginal thermonuclear ignition window. We test the robustness of this conclusion with a self-consistent, zero-dimensional kinetic power-balance model employing a Maxwell-preserving Fokker–Planck discretization, and we extend the analysis across confinement regimes. Integrating three modern cross-section parameterizations through an identical reactivity integrator, we find the thermal reactivity at 300 keV spans ~20% (Tentori–Belloni 4.4×10⁻¹⁶, Wang 3.6×10⁻¹⁶, Nevins–Swain 3.5×10⁻¹⁶ cm³/s), and that this spread alone determines whether the thermal fusion-to-bremsstrahlung ratio sits above (~1.20) or at (~1.01) threshold under an identical self-consistent electron temperature (</w:t>
+      </w:r>
+      <w:r>
+        <w:rPr>
+          <w:b w:val="0"/>
+          <w:i w:val="0"/>
+        </w:rPr>
+        <w:t>T</w:t>
+      </w:r>
+      <w:r>
+        <w:rPr>
+          <w:b w:val="0"/>
+          <w:i w:val="0"/>
+          <w:vertAlign w:val="subscript"/>
+        </w:rPr>
+        <w:t>e</w:t>
+      </w:r>
+      <w:r>
+        <w:rPr>
+          <w:b w:val="0"/>
+          <w:i w:val="0"/>
+        </w:rPr>
+        <w:t>/</w:t>
+      </w:r>
+      <w:r>
+        <w:rPr>
+          <w:b w:val="0"/>
+          <w:i w:val="0"/>
+        </w:rPr>
+        <w:t>T</w:t>
+      </w:r>
+      <w:r>
+        <w:rPr>
+          <w:b w:val="0"/>
+          <w:i w:val="0"/>
+          <w:vertAlign w:val="subscript"/>
+        </w:rPr>
+        <w:t>i</w:t>
+      </w:r>
+      <w:r>
+        <w:rPr>
+          <w:b w:val="0"/>
+          <w:i w:val="0"/>
+        </w:rPr>
+        <w:t xml:space="preserve"> ~ 0.42). The surviving net gain in the kinetic peak rests entirely on the alpha-driven R-matrix enhancement; with the Coulomb (Putvinski) enhancement alone it is sub-ignition. We further show the two principal kinetic uncertainties—steady-state alpha density and the R-matrix factor—are mathematically degenerate, so ignition is governed by a single effective parameter. Extending to a four-term net-power budget, we scan 4×10⁶ parameter combinations and find no positive net-power island under conservative (Rider) accounting; a time-dependent treatment shows the transient Te&lt;Ti window yields cycle-integrated gain &lt;&lt;1; and a 1-D treatment shows spatial separation is dominated by transport losses. Across equilibrium, combinatorial, transient, and spatial regimes, conservatively-modeled p-11B ignition remains marginal to sub-threshold. Reproducible cross-section benchmarking and uncertainty propagation are prerequisites for any p-11B ignition claim.</w:t>
       </w:r>
     </w:p>
     <w:p>
@@ -175,7 +204,7 @@
           <w:b w:val="0"/>
           <w:i w:val="0"/>
         </w:rPr>
-        <w:t>We answer this by (i) implementing three cross-section parameterizations behind one reactivity integrator (Sec. II.A–B), (ii) propagating the kinetic uncertainties through an explicit, self-consistent power balance (Sec. II.C–E, III.A–C), and (iii) extending the budget across combinatorial, time-dependent, and spatial regimes with the recirculating and transport costs retained (Sec. III.D). The result is a consistent, reproducible map of where p-11B ignition sits relative to threshold.</w:t>
+        <w:t>We answer this by (i) implementing three cross-section parameterizations behind one reactivity integrator (Sec. II.A–B), (ii) propagating the kinetic uncertainties through an explicit, self-consistent power balance (Sec. II.C–E, III.A–C), and (iii) extending the budget from the equilibrium baseline across combinatorial, time-dependent, and spatial regimes with the recirculating and transport costs retained (Sec. III.D). The result is a consistent, reproducible map of where p-11B ignition sits relative to threshold.</w:t>
       </w:r>
     </w:p>
     <w:p>

</xml_diff>

<commit_message>
Finalize inequality/subscript notation across abstract, body, captions
Typesetting only (wording/values/meaning unchanged): Te<Ti -> T_e<T_i
(subscripted) in the abstract, III.D transient paragraph, and Figure 4 caption;
<<1 -> much-less-than symbol in the abstract, spaced to match the existing
much-less/much-greater usage in Table 3 and Figure 4. No Te>Ti/Te=Ti or >>1
variants exist. Regenerated docx.

Co-Authored-By: Claude Opus 4.8 <noreply@anthropic.com>
</commit_message>
<xml_diff>
--- a/docs/manuscript_draft.docx
+++ b/docs/manuscript_draft.docx
@@ -117,7 +117,51 @@
           <w:b w:val="0"/>
           <w:i w:val="0"/>
         </w:rPr>
-        <w:t xml:space="preserve"> ~ 0.42). The surviving net gain in the kinetic peak rests entirely on the alpha-driven R-matrix enhancement; with the Coulomb (Putvinski) enhancement alone it is sub-ignition. We further show the two principal kinetic uncertainties—steady-state alpha density and the R-matrix factor—are mathematically degenerate, so ignition is governed by a single effective parameter. Extending to a four-term net-power budget, we scan 4×10⁶ parameter combinations and find no positive net-power island under conservative (Rider) accounting; a time-dependent treatment shows the transient Te&lt;Ti window yields cycle-integrated gain &lt;&lt;1; and a 1-D treatment shows spatial separation is dominated by transport losses. Across equilibrium, combinatorial, transient, and spatial regimes, conservatively-modeled p-11B ignition remains marginal to sub-threshold. Reproducible cross-section benchmarking and uncertainty propagation are prerequisites for any p-11B ignition claim.</w:t>
+        <w:t xml:space="preserve"> ~ 0.42). The surviving net gain in the kinetic peak rests entirely on the alpha-driven R-matrix enhancement; with the Coulomb (Putvinski) enhancement alone it is sub-ignition. We further show the two principal kinetic uncertainties—steady-state alpha density and the R-matrix factor—are mathematically degenerate, so ignition is governed by a single effective parameter. Extending to a four-term net-power budget, we scan 4×10⁶ parameter combinations and find no positive net-power island under conservative (Rider) accounting; a time-dependent treatment shows the transient </w:t>
+      </w:r>
+      <w:r>
+        <w:rPr>
+          <w:b w:val="0"/>
+          <w:i w:val="0"/>
+        </w:rPr>
+        <w:t>T</w:t>
+      </w:r>
+      <w:r>
+        <w:rPr>
+          <w:b w:val="0"/>
+          <w:i w:val="0"/>
+          <w:vertAlign w:val="subscript"/>
+        </w:rPr>
+        <w:t>e</w:t>
+      </w:r>
+      <w:r>
+        <w:rPr>
+          <w:b w:val="0"/>
+          <w:i w:val="0"/>
+        </w:rPr>
+        <w:t>&lt;</w:t>
+      </w:r>
+      <w:r>
+        <w:rPr>
+          <w:b w:val="0"/>
+          <w:i w:val="0"/>
+        </w:rPr>
+        <w:t>T</w:t>
+      </w:r>
+      <w:r>
+        <w:rPr>
+          <w:b w:val="0"/>
+          <w:i w:val="0"/>
+          <w:vertAlign w:val="subscript"/>
+        </w:rPr>
+        <w:t>i</w:t>
+      </w:r>
+      <w:r>
+        <w:rPr>
+          <w:b w:val="0"/>
+          <w:i w:val="0"/>
+        </w:rPr>
+        <w:t xml:space="preserve"> window yields cycle-integrated gain ≪ 1; and a 1-D treatment shows spatial separation is dominated by transport losses. Across equilibrium, combinatorial, transient, and spatial regimes, conservatively-modeled p-11B ignition remains marginal to sub-threshold. Reproducible cross-section benchmarking and uncertainty propagation are prerequisites for any p-11B ignition claim.</w:t>
       </w:r>
     </w:p>
     <w:p>
@@ -3676,7 +3720,51 @@
           <w:b w:val="0"/>
           <w:i w:val="0"/>
         </w:rPr>
-        <w:t xml:space="preserve">) tests the transient Te&lt;Ti window. The instantaneous </w:t>
+        <w:t xml:space="preserve">) tests the transient </w:t>
+      </w:r>
+      <w:r>
+        <w:rPr>
+          <w:b w:val="0"/>
+          <w:i w:val="0"/>
+        </w:rPr>
+        <w:t>T</w:t>
+      </w:r>
+      <w:r>
+        <w:rPr>
+          <w:b w:val="0"/>
+          <w:i w:val="0"/>
+          <w:vertAlign w:val="subscript"/>
+        </w:rPr>
+        <w:t>e</w:t>
+      </w:r>
+      <w:r>
+        <w:rPr>
+          <w:b w:val="0"/>
+          <w:i w:val="0"/>
+        </w:rPr>
+        <w:t>&lt;</w:t>
+      </w:r>
+      <w:r>
+        <w:rPr>
+          <w:b w:val="0"/>
+          <w:i w:val="0"/>
+        </w:rPr>
+        <w:t>T</w:t>
+      </w:r>
+      <w:r>
+        <w:rPr>
+          <w:b w:val="0"/>
+          <w:i w:val="0"/>
+          <w:vertAlign w:val="subscript"/>
+        </w:rPr>
+        <w:t>i</w:t>
+      </w:r>
+      <w:r>
+        <w:rPr>
+          <w:b w:val="0"/>
+          <w:i w:val="0"/>
+        </w:rPr>
+        <w:t xml:space="preserve"> window. The instantaneous </w:t>
       </w:r>
       <w:r>
         <w:rPr>
@@ -7528,7 +7616,57 @@
           <w:i w:val="0"/>
           <w:sz w:val="20"/>
         </w:rPr>
-        <w:t xml:space="preserve">(t) showing the transient Te&lt;Ti window (instantaneous </w:t>
+        <w:t xml:space="preserve">(t) showing the transient </w:t>
+      </w:r>
+      <w:r>
+        <w:rPr>
+          <w:b w:val="0"/>
+          <w:i w:val="0"/>
+          <w:sz w:val="20"/>
+        </w:rPr>
+        <w:t>T</w:t>
+      </w:r>
+      <w:r>
+        <w:rPr>
+          <w:b w:val="0"/>
+          <w:i w:val="0"/>
+          <w:sz w:val="20"/>
+          <w:vertAlign w:val="subscript"/>
+        </w:rPr>
+        <w:t>e</w:t>
+      </w:r>
+      <w:r>
+        <w:rPr>
+          <w:b w:val="0"/>
+          <w:i w:val="0"/>
+          <w:sz w:val="20"/>
+        </w:rPr>
+        <w:t>&lt;</w:t>
+      </w:r>
+      <w:r>
+        <w:rPr>
+          <w:b w:val="0"/>
+          <w:i w:val="0"/>
+          <w:sz w:val="20"/>
+        </w:rPr>
+        <w:t>T</w:t>
+      </w:r>
+      <w:r>
+        <w:rPr>
+          <w:b w:val="0"/>
+          <w:i w:val="0"/>
+          <w:sz w:val="20"/>
+          <w:vertAlign w:val="subscript"/>
+        </w:rPr>
+        <w:t>i</w:t>
+      </w:r>
+      <w:r>
+        <w:rPr>
+          <w:b w:val="0"/>
+          <w:i w:val="0"/>
+          <w:sz w:val="20"/>
+        </w:rPr>
+        <w:t xml:space="preserve"> window (instantaneous </w:t>
       </w:r>
       <w:r>
         <w:rPr>

</xml_diff>

<commit_message>
Insert Zenodo DOI + validation/ archive reference in Data availability and cover letter
Data availability: pinned archive is now Zenodo DOI 10.5281/zenodo.21104021
(release v2.1, commit abc42b8) + GitHub URL, replacing the branch-only reference;
Independent-verification subsection now points to validation/ and states what it
reproduces. Cover letter reproducibility item cites the same DOI and the included
independent reimplementation. Content/values unchanged; regenerated docx.

Co-Authored-By: Claude Opus 4.8 <noreply@anthropic.com>
</commit_message>
<xml_diff>
--- a/docs/manuscript_draft.docx
+++ b/docs/manuscript_draft.docx
@@ -4108,21 +4108,7 @@
           <w:b w:val="0"/>
           <w:i w:val="0"/>
         </w:rPr>
-        <w:t xml:space="preserve">All numerical results are reproduced by the released code (branch </w:t>
-      </w:r>
-      <w:r>
-        <w:rPr>
-          <w:rFonts w:ascii="Consolas" w:hAnsi="Consolas"/>
-          <w:sz w:val="20"/>
-        </w:rPr>
-        <w:t>faithful-cross-section</w:t>
-      </w:r>
-      <w:r>
-        <w:rPr>
-          <w:b w:val="0"/>
-          <w:i w:val="0"/>
-        </w:rPr>
-        <w:t>) with a fixed environment (numpy 2.x, scipy 1.x, matplotlib 3.x). Each figure and table is generated by a named script with its CSV output:</w:t>
+        <w:t>All numerical results are reproduced by the released code with a fixed environment (numpy 2.x, scipy 1.x, matplotlib 3.x). All code and data are archived at Zenodo, DOI: 10.5281/zenodo.21104021 (release v2.1, commit 27495ca), and are also available at https://github.com/msyrt-sys/pB11-kinetic-ignition. Each figure and table is generated by a named script with its CSV output:</w:t>
       </w:r>
     </w:p>
     <w:p>
@@ -4338,7 +4324,21 @@
           <w:b w:val="0"/>
           <w:i w:val="0"/>
         </w:rPr>
-        <w:t xml:space="preserve"> The principal results were reproduced by an independent from-scratch reimplementation, and anchored to published external evaluations (Tentori–Belloni 2023 cross section to 0.4%; Nevins–Swain low-temperature reactivity; the relativistic bremsstrahlung terms [9]; and the NRL ion–electron exchange rate). The cross-section coefficients were validated three independent ways against the published Table 1.</w:t>
+        <w:t xml:space="preserve"> The independent from-scratch reimplementation is included in the archive (</w:t>
+      </w:r>
+      <w:r>
+        <w:rPr>
+          <w:rFonts w:ascii="Consolas" w:hAnsi="Consolas"/>
+          <w:sz w:val="20"/>
+        </w:rPr>
+        <w:t>validation/</w:t>
+      </w:r>
+      <w:r>
+        <w:rPr>
+          <w:b w:val="0"/>
+          <w:i w:val="0"/>
+        </w:rPr>
+        <w:t>), sharing no code with the primary implementation (SI units, an independent integrator, the Wang/Rider bremsstrahlung form), and reproduces the principal results (reactivity to &lt;0.1%, thermal peaks, the combinatorial null, pulsed G&lt;1, and transport dominance). The results are additionally anchored to published external evaluations (Tentori–Belloni 2023 cross section to 0.4%; Nevins–Swain low-temperature reactivity; the relativistic bremsstrahlung terms [9]; and the NRL ion–electron exchange rate). The cross-section coefficients were validated three independent ways against the published Table 1.</w:t>
       </w:r>
     </w:p>
     <w:p>

</xml_diff>

<commit_message>
Simplify Fig 3: drop near-empty positive-sample projection panels
Multiple reviews flagged that Fig 3's lower projection panels (r_ash/tau/
eta_drive vs eta_ch) look empty because only 2 of 4.19e6 samples are positive
(scientifically correct but visually confusing). Removed the projection panel
(montecarlo_projection.png) from the manuscript figure across all formats, keeping
the four histograms (Wang/TB x variant i/ii) that carry the result; updated the
caption and the in-text sentence that had promised a 'parameter projection'. The
'only 2 of 4.19e6, all at optimistic ceiling' fact remains stated in III.D.
Applied to .md, .tex, build_docx FIG_MAP; regenerated .docx (8->7 images) and
recompiled .pdf (9 pages, clean). No numeric result changed; the projection PNG
remains a script diagnostic in figures/.

Co-Authored-By: Claude Opus 4.8 <noreply@anthropic.com>
</commit_message>
<xml_diff>
--- a/docs/manuscript_draft.docx
+++ b/docs/manuscript_draft.docx
@@ -3682,7 +3682,7 @@
           <w:b w:val="0"/>
           <w:i w:val="0"/>
         </w:rPr>
-        <w:t>, both negative. Figure 3 shows the net-power distribution and the parameter projection of the rare positive samples.</w:t>
+        <w:t>, both negative. Figure 3 shows the net-power distribution.</w:t>
       </w:r>
     </w:p>
     <w:p>
@@ -7309,46 +7309,6 @@
     </w:p>
     <w:p>
       <w:pPr>
-        <w:spacing w:before="120"/>
-        <w:jc w:val="center"/>
-      </w:pPr>
-      <w:r>
-        <w:drawing>
-          <wp:inline xmlns:a="http://schemas.openxmlformats.org/drawingml/2006/main" xmlns:pic="http://schemas.openxmlformats.org/drawingml/2006/picture">
-            <wp:extent cx="5852160" cy="1832052"/>
-            <wp:docPr id="4" name="Picture 4"/>
-            <wp:cNvGraphicFramePr>
-              <a:graphicFrameLocks noChangeAspect="1"/>
-            </wp:cNvGraphicFramePr>
-            <a:graphic>
-              <a:graphicData uri="http://schemas.openxmlformats.org/drawingml/2006/picture">
-                <pic:pic>
-                  <pic:nvPicPr>
-                    <pic:cNvPr id="0" name="montecarlo_projection.png"/>
-                    <pic:cNvPicPr/>
-                  </pic:nvPicPr>
-                  <pic:blipFill>
-                    <a:blip r:embed="rId12"/>
-                    <a:stretch>
-                      <a:fillRect/>
-                    </a:stretch>
-                  </pic:blipFill>
-                  <pic:spPr>
-                    <a:xfrm>
-                      <a:off x="0" y="0"/>
-                      <a:ext cx="5852160" cy="1832052"/>
-                    </a:xfrm>
-                    <a:prstGeom prst="rect"/>
-                  </pic:spPr>
-                </pic:pic>
-              </a:graphicData>
-            </a:graphic>
-          </wp:inline>
-        </w:drawing>
-      </w:r>
-    </w:p>
-    <w:p>
-      <w:pPr>
         <w:spacing w:after="200"/>
       </w:pPr>
       <w:r>
@@ -7365,7 +7325,7 @@
           <w:i w:val="0"/>
           <w:sz w:val="20"/>
         </w:rPr>
-        <w:t xml:space="preserve"> Combinatorial net-power scan (4.19×10⁶ Sobol samples, seven free levers). Top: distribution of </w:t>
+        <w:t xml:space="preserve"> Combinatorial net-power scan (4.19×10⁶ Sobol samples, seven free levers): distribution of </w:t>
       </w:r>
       <w:r>
         <w:rPr>
@@ -7415,7 +7375,7 @@
           <w:i w:val="0"/>
           <w:sz w:val="20"/>
         </w:rPr>
-        <w:t xml:space="preserve"> for the two cross sections and the two recirculation-accounting variants, with the ignition threshold marked; the strict-accounting Wang distribution lies entirely below threshold.</w:t>
+        <w:t xml:space="preserve"> for the two cross sections and the two recirculation-accounting variants, with the ignition threshold marked. The strict-accounting Wang distribution lies entirely below threshold.</w:t>
       </w:r>
     </w:p>
     <w:p>
@@ -7427,7 +7387,7 @@
         <w:drawing>
           <wp:inline xmlns:a="http://schemas.openxmlformats.org/drawingml/2006/main" xmlns:pic="http://schemas.openxmlformats.org/drawingml/2006/picture">
             <wp:extent cx="5852160" cy="4114327"/>
-            <wp:docPr id="5" name="Picture 5"/>
+            <wp:docPr id="4" name="Picture 4"/>
             <wp:cNvGraphicFramePr>
               <a:graphicFrameLocks noChangeAspect="1"/>
             </wp:cNvGraphicFramePr>
@@ -7439,7 +7399,7 @@
                     <pic:cNvPicPr/>
                   </pic:nvPicPr>
                   <pic:blipFill>
-                    <a:blip r:embed="rId13"/>
+                    <a:blip r:embed="rId12"/>
                     <a:stretch>
                       <a:fillRect/>
                     </a:stretch>
@@ -7467,7 +7427,7 @@
         <w:drawing>
           <wp:inline xmlns:a="http://schemas.openxmlformats.org/drawingml/2006/main" xmlns:pic="http://schemas.openxmlformats.org/drawingml/2006/picture">
             <wp:extent cx="5852160" cy="4332078"/>
-            <wp:docPr id="6" name="Picture 6"/>
+            <wp:docPr id="5" name="Picture 5"/>
             <wp:cNvGraphicFramePr>
               <a:graphicFrameLocks noChangeAspect="1"/>
             </wp:cNvGraphicFramePr>
@@ -7479,7 +7439,7 @@
                     <pic:cNvPicPr/>
                   </pic:nvPicPr>
                   <pic:blipFill>
-                    <a:blip r:embed="rId14"/>
+                    <a:blip r:embed="rId13"/>
                     <a:stretch>
                       <a:fillRect/>
                     </a:stretch>
@@ -7803,7 +7763,7 @@
         <w:drawing>
           <wp:inline xmlns:a="http://schemas.openxmlformats.org/drawingml/2006/main" xmlns:pic="http://schemas.openxmlformats.org/drawingml/2006/picture">
             <wp:extent cx="5852160" cy="1746757"/>
-            <wp:docPr id="7" name="Picture 7"/>
+            <wp:docPr id="6" name="Picture 6"/>
             <wp:cNvGraphicFramePr>
               <a:graphicFrameLocks noChangeAspect="1"/>
             </wp:cNvGraphicFramePr>
@@ -7815,7 +7775,7 @@
                     <pic:cNvPicPr/>
                   </pic:nvPicPr>
                   <pic:blipFill>
-                    <a:blip r:embed="rId15"/>
+                    <a:blip r:embed="rId14"/>
                     <a:stretch>
                       <a:fillRect/>
                     </a:stretch>
@@ -7843,7 +7803,7 @@
         <w:drawing>
           <wp:inline xmlns:a="http://schemas.openxmlformats.org/drawingml/2006/main" xmlns:pic="http://schemas.openxmlformats.org/drawingml/2006/picture">
             <wp:extent cx="5852160" cy="2619876"/>
-            <wp:docPr id="8" name="Picture 8"/>
+            <wp:docPr id="7" name="Picture 7"/>
             <wp:cNvGraphicFramePr>
               <a:graphicFrameLocks noChangeAspect="1"/>
             </wp:cNvGraphicFramePr>
@@ -7855,7 +7815,7 @@
                     <pic:cNvPicPr/>
                   </pic:nvPicPr>
                   <pic:blipFill>
-                    <a:blip r:embed="rId16"/>
+                    <a:blip r:embed="rId15"/>
                     <a:stretch>
                       <a:fillRect/>
                     </a:stretch>

</xml_diff>

<commit_message>
II.E brems: present coefficient in NRL-standard practical units, drop the m^-3 SI form
Reviewer flagged the mixed n[m^-3]+T[keV] SI form as an unusual convention.
All values were mathematically correct, but n in m^-3 with T in keV is not a
form used anywhere else in the paper. Reworked the presentation to the two
recognizable practical conventions (both cm^-3): the code's keV form
(5.34e-31, primary) and the NRL Formulary's published value (1.69e-32 for T_e
in eV), with the exact keV rescale (x sqrt(1000)) shown; removed the m^-3 /
W·m^-3 clause entirely. Makes the 'standard NRL value' claim verifiable against
ref [8] and eliminates the odd mixed-SI form. All coefficients were verified
numerically to give identical P_B (0.0000% spread). No physics/number changed;
presentation only. Applied to .md + .tex; regenerated .docx + .pdf (9 pages, clean).

Co-Authored-By: Claude Opus 4.8 <noreply@anthropic.com>
</commit_message>
<xml_diff>
--- a/docs/manuscript_draft.docx
+++ b/docs/manuscript_draft.docx
@@ -1221,7 +1221,7 @@
           <w:b w:val="0"/>
           <w:i w:val="0"/>
         </w:rPr>
-        <w:t xml:space="preserve">². The coefficient is the standard NRL classical value [8] evaluated in </w:t>
+        <w:t xml:space="preserve">². The coefficient is evaluated in </w:t>
       </w:r>
       <w:r>
         <w:rPr>
@@ -1301,7 +1301,7 @@
           <w:b w:val="0"/>
           <w:i w:val="0"/>
         </w:rPr>
-        <w:t xml:space="preserve"> in W/cm³); it is equivalent to 1.69×10⁻³² with </w:t>
+        <w:t xml:space="preserve"> in W/cm³); it is the standard NRL classical value [8], tabulated in the Formulary as 1.69×10⁻³² for </w:t>
       </w:r>
       <w:r>
         <w:rPr>
@@ -1323,7 +1323,7 @@
           <w:b w:val="0"/>
           <w:i w:val="0"/>
         </w:rPr>
-        <w:t xml:space="preserve"> in eV, and to 5.34×10⁻³⁷ in SI units (</w:t>
+        <w:t xml:space="preserve"> in eV (</w:t>
       </w:r>
       <w:r>
         <w:rPr>
@@ -1345,7 +1345,29 @@
           <w:b w:val="0"/>
           <w:i w:val="0"/>
         </w:rPr>
-        <w:t xml:space="preserve"> in m⁻³, </w:t>
+        <w:t xml:space="preserve"> in cm⁻³, </w:t>
+      </w:r>
+      <w:r>
+        <w:rPr>
+          <w:b w:val="0"/>
+          <w:i w:val="0"/>
+        </w:rPr>
+        <w:t>P</w:t>
+      </w:r>
+      <w:r>
+        <w:rPr>
+          <w:b w:val="0"/>
+          <w:i w:val="0"/>
+          <w:vertAlign w:val="subscript"/>
+        </w:rPr>
+        <w:t>B</w:t>
+      </w:r>
+      <w:r>
+        <w:rPr>
+          <w:b w:val="0"/>
+          <w:i w:val="0"/>
+        </w:rPr>
+        <w:t xml:space="preserve"> in W/cm³) and rescaled here to </w:t>
       </w:r>
       <w:r>
         <w:rPr>
@@ -1367,29 +1389,7 @@
           <w:b w:val="0"/>
           <w:i w:val="0"/>
         </w:rPr>
-        <w:t xml:space="preserve"> in keV, </w:t>
-      </w:r>
-      <w:r>
-        <w:rPr>
-          <w:b w:val="0"/>
-          <w:i w:val="0"/>
-        </w:rPr>
-        <w:t>P</w:t>
-      </w:r>
-      <w:r>
-        <w:rPr>
-          <w:b w:val="0"/>
-          <w:i w:val="0"/>
-          <w:vertAlign w:val="subscript"/>
-        </w:rPr>
-        <w:t>B</w:t>
-      </w:r>
-      <w:r>
-        <w:rPr>
-          <w:b w:val="0"/>
-          <w:i w:val="0"/>
-        </w:rPr>
-        <w:t xml:space="preserve"> in W/m³). The correction g(x) contains the e–i and e–e relativistic terms (Svensson form) and was cross-checked against the recent independent analytical bremsstrahlung fit of Xie [9], which spans the e–i and e–e contributions to &lt;1% over the relevant temperature range. (We adopt the NRL classical coefficient; the Wang 2026 power balance uses a value ~3% lower, a Gaunt/Born convention difference — at the near-threshold thermal margin a further small modeling sensitivity, Sec. III.D.) </w:t>
+        <w:t xml:space="preserve"> in keV (×√1000 = 5.34×10⁻³¹), the natural unit over the 100–600 keV range of interest. The correction g(x) contains the e–i and e–e relativistic terms (Svensson form) and was cross-checked against the recent independent analytical bremsstrahlung fit of Xie [9], which spans the e–i and e–e contributions to &lt;1% over the relevant temperature range. (We adopt the NRL classical coefficient; the Wang 2026 power balance uses a value ~3% lower, a Gaunt/Born convention difference — at the near-threshold thermal margin a further small modeling sensitivity, Sec. III.D.) </w:t>
       </w:r>
       <w:r>
         <w:rPr>

</xml_diff>

<commit_message>
Regenerate figures at 300 DPI + vector PDFs for PoP submission quality
PoP requires 300+ DPI figures. The 8 figure PNGs were at 125-140 DPI. Updated
the 5 figure scripts to savefig dpi=300 and to also emit a vector PDF alongside
each PNG (fig_cross_sections, sensitivity_analysis_2d, alpha_channeling_montecarlo,
pulsed_0d_model, radial_1d_model). Re-ran all five: PNGs now 300 DPI (pixel
dimensions ~doubled) and figures/*.pdf vector versions produced. Switched the
REVTeX \includegraphics to the .pdf (vector) figures; docx keeps the 300-DPI
PNGs. Recompiled (9 pages, clean) - manuscript.pdf shrank ~1.37MB->0.75MB as
vectors replaced raster. Visual QC: line-art (Fig 1) crisp vector; heatmaps
(Fig 5) smooth, not blocky. No numbers/content changed.

Co-Authored-By: Claude Opus 4.8 <noreply@anthropic.com>
</commit_message>
<xml_diff>
--- a/docs/manuscript_draft.docx
+++ b/docs/manuscript_draft.docx
@@ -7304,7 +7304,7 @@
       <w:r>
         <w:drawing>
           <wp:inline xmlns:a="http://schemas.openxmlformats.org/drawingml/2006/main" xmlns:pic="http://schemas.openxmlformats.org/drawingml/2006/picture">
-            <wp:extent cx="5852160" cy="2227011"/>
+            <wp:extent cx="5852160" cy="2215753"/>
             <wp:docPr id="1" name="Picture 1"/>
             <wp:cNvGraphicFramePr>
               <a:graphicFrameLocks noChangeAspect="1"/>
@@ -7325,7 +7325,7 @@
                   <pic:spPr>
                     <a:xfrm>
                       <a:off x="0" y="0"/>
-                      <a:ext cx="5852160" cy="2227011"/>
+                      <a:ext cx="5852160" cy="2215753"/>
                     </a:xfrm>
                     <a:prstGeom prst="rect"/>
                   </pic:spPr>
@@ -7365,7 +7365,7 @@
       <w:r>
         <w:drawing>
           <wp:inline xmlns:a="http://schemas.openxmlformats.org/drawingml/2006/main" xmlns:pic="http://schemas.openxmlformats.org/drawingml/2006/picture">
-            <wp:extent cx="5852160" cy="4752320"/>
+            <wp:extent cx="5852160" cy="4738514"/>
             <wp:docPr id="2" name="Picture 2"/>
             <wp:cNvGraphicFramePr>
               <a:graphicFrameLocks noChangeAspect="1"/>
@@ -7386,7 +7386,7 @@
                   <pic:spPr>
                     <a:xfrm>
                       <a:off x="0" y="0"/>
-                      <a:ext cx="5852160" cy="4752320"/>
+                      <a:ext cx="5852160" cy="4738514"/>
                     </a:xfrm>
                     <a:prstGeom prst="rect"/>
                   </pic:spPr>
@@ -7651,7 +7651,7 @@
       <w:r>
         <w:drawing>
           <wp:inline xmlns:a="http://schemas.openxmlformats.org/drawingml/2006/main" xmlns:pic="http://schemas.openxmlformats.org/drawingml/2006/picture">
-            <wp:extent cx="5852160" cy="4020208"/>
+            <wp:extent cx="5852160" cy="4015980"/>
             <wp:docPr id="3" name="Picture 3"/>
             <wp:cNvGraphicFramePr>
               <a:graphicFrameLocks noChangeAspect="1"/>
@@ -7672,7 +7672,7 @@
                   <pic:spPr>
                     <a:xfrm>
                       <a:off x="0" y="0"/>
-                      <a:ext cx="5852160" cy="4020208"/>
+                      <a:ext cx="5852160" cy="4015980"/>
                     </a:xfrm>
                     <a:prstGeom prst="rect"/>
                   </pic:spPr>
@@ -7762,7 +7762,7 @@
       <w:r>
         <w:drawing>
           <wp:inline xmlns:a="http://schemas.openxmlformats.org/drawingml/2006/main" xmlns:pic="http://schemas.openxmlformats.org/drawingml/2006/picture">
-            <wp:extent cx="5852160" cy="4114327"/>
+            <wp:extent cx="5852160" cy="4111633"/>
             <wp:docPr id="4" name="Picture 4"/>
             <wp:cNvGraphicFramePr>
               <a:graphicFrameLocks noChangeAspect="1"/>
@@ -7783,7 +7783,7 @@
                   <pic:spPr>
                     <a:xfrm>
                       <a:off x="0" y="0"/>
-                      <a:ext cx="5852160" cy="4114327"/>
+                      <a:ext cx="5852160" cy="4111633"/>
                     </a:xfrm>
                     <a:prstGeom prst="rect"/>
                   </pic:spPr>
@@ -7802,7 +7802,7 @@
       <w:r>
         <w:drawing>
           <wp:inline xmlns:a="http://schemas.openxmlformats.org/drawingml/2006/main" xmlns:pic="http://schemas.openxmlformats.org/drawingml/2006/picture">
-            <wp:extent cx="5852160" cy="4332078"/>
+            <wp:extent cx="5852160" cy="4335280"/>
             <wp:docPr id="5" name="Picture 5"/>
             <wp:cNvGraphicFramePr>
               <a:graphicFrameLocks noChangeAspect="1"/>
@@ -7823,7 +7823,7 @@
                   <pic:spPr>
                     <a:xfrm>
                       <a:off x="0" y="0"/>
-                      <a:ext cx="5852160" cy="4332078"/>
+                      <a:ext cx="5852160" cy="4335280"/>
                     </a:xfrm>
                     <a:prstGeom prst="rect"/>
                   </pic:spPr>
@@ -8138,7 +8138,7 @@
       <w:r>
         <w:drawing>
           <wp:inline xmlns:a="http://schemas.openxmlformats.org/drawingml/2006/main" xmlns:pic="http://schemas.openxmlformats.org/drawingml/2006/picture">
-            <wp:extent cx="5852160" cy="1746757"/>
+            <wp:extent cx="5852160" cy="1747528"/>
             <wp:docPr id="6" name="Picture 6"/>
             <wp:cNvGraphicFramePr>
               <a:graphicFrameLocks noChangeAspect="1"/>
@@ -8159,7 +8159,7 @@
                   <pic:spPr>
                     <a:xfrm>
                       <a:off x="0" y="0"/>
-                      <a:ext cx="5852160" cy="1746757"/>
+                      <a:ext cx="5852160" cy="1747528"/>
                     </a:xfrm>
                     <a:prstGeom prst="rect"/>
                   </pic:spPr>
@@ -8178,7 +8178,7 @@
       <w:r>
         <w:drawing>
           <wp:inline xmlns:a="http://schemas.openxmlformats.org/drawingml/2006/main" xmlns:pic="http://schemas.openxmlformats.org/drawingml/2006/picture">
-            <wp:extent cx="5852160" cy="2619876"/>
+            <wp:extent cx="5852160" cy="2614648"/>
             <wp:docPr id="7" name="Picture 7"/>
             <wp:cNvGraphicFramePr>
               <a:graphicFrameLocks noChangeAspect="1"/>
@@ -8199,7 +8199,7 @@
                   <pic:spPr>
                     <a:xfrm>
                       <a:off x="0" y="0"/>
-                      <a:ext cx="5852160" cy="2619876"/>
+                      <a:ext cx="5852160" cy="2614648"/>
                     </a:xfrm>
                     <a:prstGeom prst="rect"/>
                   </pic:spPr>

</xml_diff>

<commit_message>
Fig 4 & 5: convert power-density axes erg/s/cm3 -> W/cm3 (match text); LaTeX-ify labels
Referee-proofing figure units. The pulsed (Fig 4) and radial (Fig 5) models
compute internally in CGS and their axes read erg/s/cm3, while the text uses
W/cm3. Divided the plotted power densities by 1e7 (erg/s -> W) and relabeled
the axes W/cm3 (local densities) and W/cm (per-length transport panel);
physics/message unchanged (only axis tick magnitudes shift). Also converted
code-style figure labels/titles to publication LaTeX math: P_cond/INT P_fus ->
/\int P_fus$, log10(P_transport/INT P_fus), Te<0.9Ti, the G-map colorbar
=E_fus/(E_spark+E_brems+E_trans)$, and the maps suptitle
 \gg P_fus$ (dropped the informal 'catastrophic'). Regenerated the 4
figures (300 DPI PNG + vector PDF), docx + recompiled pdf (9 pages, clean);
visually QC'd Fig 4/5. No numbers/content changed.

Co-Authored-By: Claude Opus 4.8 <noreply@anthropic.com>
</commit_message>
<xml_diff>
--- a/docs/manuscript_draft.docx
+++ b/docs/manuscript_draft.docx
@@ -7899,7 +7899,7 @@
       <w:r>
         <w:drawing>
           <wp:inline xmlns:a="http://schemas.openxmlformats.org/drawingml/2006/main" xmlns:pic="http://schemas.openxmlformats.org/drawingml/2006/picture">
-            <wp:extent cx="5852160" cy="4335280"/>
+            <wp:extent cx="5852160" cy="4327367"/>
             <wp:docPr id="5" name="Picture 5"/>
             <wp:cNvGraphicFramePr>
               <a:graphicFrameLocks noChangeAspect="1"/>
@@ -7920,7 +7920,7 @@
                   <pic:spPr>
                     <a:xfrm>
                       <a:off x="0" y="0"/>
-                      <a:ext cx="5852160" cy="4335280"/>
+                      <a:ext cx="5852160" cy="4327367"/>
                     </a:xfrm>
                     <a:prstGeom prst="rect"/>
                   </pic:spPr>
@@ -8235,7 +8235,7 @@
       <w:r>
         <w:drawing>
           <wp:inline xmlns:a="http://schemas.openxmlformats.org/drawingml/2006/main" xmlns:pic="http://schemas.openxmlformats.org/drawingml/2006/picture">
-            <wp:extent cx="5852160" cy="1747528"/>
+            <wp:extent cx="5852160" cy="1770311"/>
             <wp:docPr id="6" name="Picture 6"/>
             <wp:cNvGraphicFramePr>
               <a:graphicFrameLocks noChangeAspect="1"/>
@@ -8256,7 +8256,7 @@
                   <pic:spPr>
                     <a:xfrm>
                       <a:off x="0" y="0"/>
-                      <a:ext cx="5852160" cy="1747528"/>
+                      <a:ext cx="5852160" cy="1770311"/>
                     </a:xfrm>
                     <a:prstGeom prst="rect"/>
                   </pic:spPr>
@@ -8275,7 +8275,7 @@
       <w:r>
         <w:drawing>
           <wp:inline xmlns:a="http://schemas.openxmlformats.org/drawingml/2006/main" xmlns:pic="http://schemas.openxmlformats.org/drawingml/2006/picture">
-            <wp:extent cx="5852160" cy="2614648"/>
+            <wp:extent cx="5852160" cy="2617734"/>
             <wp:docPr id="7" name="Picture 7"/>
             <wp:cNvGraphicFramePr>
               <a:graphicFrameLocks noChangeAspect="1"/>
@@ -8296,7 +8296,7 @@
                   <pic:spPr>
                     <a:xfrm>
                       <a:off x="0" y="0"/>
-                      <a:ext cx="5852160" cy="2614648"/>
+                      <a:ext cx="5852160" cy="2617734"/>
                     </a:xfrm>
                     <a:prstGeom prst="rect"/>
                   </pic:spPr>

</xml_diff>